<commit_message>
Fix requirement gaps found by the bug board, trace logged bugs in the RTM and SRS, correct the activity diagram, and tidy file names.
</commit_message>
<xml_diff>
--- a/1-RE/Requirements_Table.docx
+++ b/1-RE/Requirements_Table.docx
@@ -356,7 +356,7 @@
               <w:rPr>
                 <w:sz w:val="18"/>
               </w:rPr>
-              <w:t>Pass: A complete questionnaire creates an application in 'Pending Review', linked to the animal and applicant, that appears in the staff review queue within 5 seconds. Fail: An application is created with a required field missing, for an animal that is not 'Ready for Adoption', or as a second open application by the same applicant for the same animal.</w:t>
+              <w:t>Pass: A complete questionnaire creates an application in 'Pending Review', linked to the animal and applicant, that appears in the staff review queue within 5 seconds. Fail: An application is created with a required field missing, for an animal that is not 'Ready for Adoption' or has been removed from the catalog, or as a second open application by the same applicant for the same animal.</w:t>
             </w:r>
           </w:p>
         </w:tc>
@@ -518,7 +518,7 @@
               <w:rPr>
                 <w:sz w:val="18"/>
               </w:rPr>
-              <w:t>Pass: Marking an animal 'In Foster' requires a placement with start date, expected end date and caregiver; a placement past its expected end date appears in the staff overdue list; ending a placement returns the animal to 'Ready for Adoption'. Fail: An 'In Foster' animal has no active placement, an overdue placement is not flagged, or an ended placement leaves the animal 'In Foster'.</w:t>
+              <w:t>Pass: Marking an animal 'In Foster' requires a placement with start date, caregiver and an expected end date later than the start date; a placement past its expected end date appears in the staff overdue list; ending a placement restores the animal's previous status ('In Intake' or 'Ready for Adoption'). Fail: A placement is saved with an end date on or before its start date, an 'In Foster' animal has no active placement, an overdue placement is not flagged, or an ended placement leaves the animal 'In Foster'.</w:t>
             </w:r>
           </w:p>
         </w:tc>

</xml_diff>